<commit_message>
Point deliverables at GitHub instead of a zip upload.
Co-authored-by: Cursor <cursoragent@cursor.com>
</commit_message>
<xml_diff>
--- a/ReqRes_App_Deliverables.docx
+++ b/ReqRes_App_Deliverables.docx
@@ -54,7 +54,7 @@
                 <w:color w:val="FFFFFF"/>
                 <w:sz w:val="22"/>
               </w:rPr>
-              <w:t>SOURCE CODE ZIP  —  Google Drive link</w:t>
+              <w:t>SOURCE CODE  —  GitHub repository</w:t>
             </w:r>
           </w:p>
         </w:tc>
@@ -73,7 +73,7 @@
                 <w:color w:val="2C1FA8"/>
                 <w:sz w:val="24"/>
               </w:rPr>
-              <w:t>PASTE YOUR GOOGLE DRIVE ZIP LINK HERE</w:t>
+              <w:t>https://github.com/JOTHSHANA/React-native-interview</w:t>
             </w:r>
           </w:p>
           <w:p>
@@ -84,7 +84,7 @@
                 <w:color w:val="6B6680"/>
                 <w:sz w:val="20"/>
               </w:rPr>
-              <w:t>Upload the project zip to Google Drive, set access to Anyone with the link, then replace the line above with the URL.</w:t>
+              <w:t>Clone this repository. Copy .env.example to .env and add the ReqRes API key. Do not commit .env.</w:t>
             </w:r>
           </w:p>
         </w:tc>
@@ -294,7 +294,7 @@
           <w:color w:val="1A1530"/>
           <w:sz w:val="22"/>
         </w:rPr>
-        <w:t>The zip contains the full Expo project: App.js, index.js, package.json, app.json, .env.example, README.md, and the src/ folder. Install with npm install and run with npx expo start. Do not commit .env; the real API key stays in a local .env file.</w:t>
+        <w:t>The full Expo project is on GitHub. It includes App.js, index.js, package.json, app.json, .env.example, README.md, and the src/ folder. Clone the repo, run npm install, then npx expo start. The real API key stays in a local .env file and is not in the repository.</w:t>
       </w:r>
     </w:p>
     <w:p>
@@ -815,6 +815,41 @@
           <w:color w:val="1A1530"/>
           <w:sz w:val="22"/>
         </w:rPr>
+        <w:t>Clone from GitHub</w:t>
+      </w:r>
+    </w:p>
+    <w:p>
+      <w:pPr>
+        <w:spacing w:after="160"/>
+        <w:ind w:left="288"/>
+      </w:pPr>
+      <w:r>
+        <w:rPr>
+          <w:rFonts w:ascii="Consolas" w:hAnsi="Consolas" w:eastAsia="Consolas"/>
+          <w:b w:val="0"/>
+          <w:color w:val="2C1FA8"/>
+          <w:sz w:val="20"/>
+        </w:rPr>
+        <w:t>git clone https://github.com/JOTHSHANA/React-native-interview.git</w:t>
+        <w:br/>
+        <w:t>cd React-native-interview</w:t>
+        <w:br/>
+        <w:t>npm install</w:t>
+        <w:br/>
+        <w:t># copy .env.example to .env and add EXPO_PUBLIC_API_KEY</w:t>
+      </w:r>
+    </w:p>
+    <w:p>
+      <w:pPr>
+        <w:spacing w:after="160" w:before="0"/>
+      </w:pPr>
+      <w:r>
+        <w:rPr>
+          <w:rFonts w:ascii="Calibri" w:hAnsi="Calibri" w:eastAsia="Calibri"/>
+          <w:b w:val="0"/>
+          <w:color w:val="1A1530"/>
+          <w:sz w:val="22"/>
+        </w:rPr>
         <w:t>Phone (Expo Go)</w:t>
       </w:r>
     </w:p>
@@ -830,10 +865,6 @@
           <w:color w:val="2C1FA8"/>
           <w:sz w:val="20"/>
         </w:rPr>
-        <w:t>npm install</w:t>
-        <w:br/>
-        <w:t># create .env with EXPO_PUBLIC_API_KEY</w:t>
-        <w:br/>
         <w:t>npx expo start</w:t>
         <w:br/>
         <w:t># or: npx expo start --tunnel</w:t>
@@ -1189,7 +1220,7 @@
           <w:color w:val="1A1530"/>
           <w:sz w:val="32"/>
         </w:rPr>
-        <w:t>7. Zip contents to upload</w:t>
+        <w:t>7. Source code location</w:t>
       </w:r>
     </w:p>
     <w:p>
@@ -1203,7 +1234,7 @@
           <w:color w:val="1A1530"/>
           <w:sz w:val="22"/>
         </w:rPr>
-        <w:t>Zip the project folder. Exclude node_modules, .expo, and .env (keep .env.example). After uploading to Drive, paste the share link in the purple box at the top of this document.</w:t>
+        <w:t>Source code is hosted on GitHub (no zip file): https://github.com/JOTHSHANA/React-native-interview</w:t>
       </w:r>
     </w:p>
     <w:p>

</xml_diff>